<commit_message>
báo cáo kết quả train
</commit_message>
<xml_diff>
--- a/Báo cáo kết quả train.docx
+++ b/Báo cáo kết quả train.docx
@@ -371,6 +371,9 @@
         <w:keepNext/>
       </w:pPr>
       <w:r>
+        <w:rPr>
+          <w:noProof/>
+        </w:rPr>
         <w:drawing>
           <wp:inline distT="0" distB="0" distL="0" distR="0" wp14:anchorId="78706E56" wp14:editId="66E243B9">
             <wp:extent cx="5943600" cy="2697480"/>
@@ -448,6 +451,57 @@
         </w:rPr>
         <w:t xml:space="preserve"> 1</w:t>
       </w:r>
+      <w:r>
+        <w:t xml:space="preserve"> </w:t>
+      </w:r>
+      <w:proofErr w:type="spellStart"/>
+      <w:r>
+        <w:rPr>
+          <w:sz w:val="28"/>
+          <w:szCs w:val="28"/>
+        </w:rPr>
+        <w:t>Không</w:t>
+      </w:r>
+      <w:proofErr w:type="spellEnd"/>
+      <w:r>
+        <w:rPr>
+          <w:sz w:val="28"/>
+          <w:szCs w:val="28"/>
+        </w:rPr>
+        <w:t xml:space="preserve"> </w:t>
+      </w:r>
+      <w:proofErr w:type="spellStart"/>
+      <w:r>
+        <w:rPr>
+          <w:sz w:val="28"/>
+          <w:szCs w:val="28"/>
+        </w:rPr>
+        <w:t>sử</w:t>
+      </w:r>
+      <w:proofErr w:type="spellEnd"/>
+      <w:r>
+        <w:rPr>
+          <w:sz w:val="28"/>
+          <w:szCs w:val="28"/>
+        </w:rPr>
+        <w:t xml:space="preserve"> </w:t>
+      </w:r>
+      <w:proofErr w:type="spellStart"/>
+      <w:r>
+        <w:rPr>
+          <w:sz w:val="28"/>
+          <w:szCs w:val="28"/>
+        </w:rPr>
+        <w:t>dụng</w:t>
+      </w:r>
+      <w:proofErr w:type="spellEnd"/>
+      <w:r>
+        <w:rPr>
+          <w:sz w:val="28"/>
+          <w:szCs w:val="28"/>
+        </w:rPr>
+        <w:t xml:space="preserve"> Permutation Importance (PI)</w:t>
+      </w:r>
     </w:p>
     <w:p/>
     <w:p>
@@ -455,6 +509,9 @@
         <w:keepNext/>
       </w:pPr>
       <w:r>
+        <w:rPr>
+          <w:noProof/>
+        </w:rPr>
         <w:drawing>
           <wp:inline distT="0" distB="0" distL="0" distR="0" wp14:anchorId="23C8E8FD" wp14:editId="7483DCA8">
             <wp:extent cx="5943600" cy="3025140"/>
@@ -532,6 +589,130 @@
         </w:rPr>
         <w:t xml:space="preserve"> 2</w:t>
       </w:r>
+      <w:r>
+        <w:t xml:space="preserve"> </w:t>
+      </w:r>
+      <w:proofErr w:type="spellStart"/>
+      <w:r>
+        <w:rPr>
+          <w:sz w:val="28"/>
+          <w:szCs w:val="28"/>
+        </w:rPr>
+        <w:t>Có</w:t>
+      </w:r>
+      <w:proofErr w:type="spellEnd"/>
+      <w:r>
+        <w:rPr>
+          <w:sz w:val="28"/>
+          <w:szCs w:val="28"/>
+        </w:rPr>
+        <w:t xml:space="preserve"> </w:t>
+      </w:r>
+      <w:proofErr w:type="spellStart"/>
+      <w:r>
+        <w:rPr>
+          <w:sz w:val="28"/>
+          <w:szCs w:val="28"/>
+        </w:rPr>
+        <w:t>sử</w:t>
+      </w:r>
+      <w:proofErr w:type="spellEnd"/>
+      <w:r>
+        <w:rPr>
+          <w:sz w:val="28"/>
+          <w:szCs w:val="28"/>
+        </w:rPr>
+        <w:t xml:space="preserve"> </w:t>
+      </w:r>
+      <w:proofErr w:type="spellStart"/>
+      <w:r>
+        <w:rPr>
+          <w:sz w:val="28"/>
+          <w:szCs w:val="28"/>
+        </w:rPr>
+        <w:t>dụng</w:t>
+      </w:r>
+      <w:proofErr w:type="spellEnd"/>
+      <w:r>
+        <w:rPr>
+          <w:sz w:val="28"/>
+          <w:szCs w:val="28"/>
+        </w:rPr>
+        <w:t xml:space="preserve"> PI </w:t>
+      </w:r>
+      <w:proofErr w:type="spellStart"/>
+      <w:r>
+        <w:rPr>
+          <w:sz w:val="28"/>
+          <w:szCs w:val="28"/>
+        </w:rPr>
+        <w:t>và</w:t>
+      </w:r>
+      <w:proofErr w:type="spellEnd"/>
+      <w:r>
+        <w:rPr>
+          <w:sz w:val="28"/>
+          <w:szCs w:val="28"/>
+        </w:rPr>
+        <w:t xml:space="preserve"> </w:t>
+      </w:r>
+      <w:proofErr w:type="spellStart"/>
+      <w:r>
+        <w:rPr>
+          <w:sz w:val="28"/>
+          <w:szCs w:val="28"/>
+        </w:rPr>
+        <w:t>loại</w:t>
+      </w:r>
+      <w:proofErr w:type="spellEnd"/>
+      <w:r>
+        <w:rPr>
+          <w:sz w:val="28"/>
+          <w:szCs w:val="28"/>
+        </w:rPr>
+        <w:t xml:space="preserve"> </w:t>
+      </w:r>
+      <w:proofErr w:type="spellStart"/>
+      <w:r>
+        <w:rPr>
+          <w:sz w:val="28"/>
+          <w:szCs w:val="28"/>
+        </w:rPr>
+        <w:t>bỏ</w:t>
+      </w:r>
+      <w:proofErr w:type="spellEnd"/>
+      <w:r>
+        <w:rPr>
+          <w:sz w:val="28"/>
+          <w:szCs w:val="28"/>
+        </w:rPr>
+        <w:t xml:space="preserve"> 5 </w:t>
+      </w:r>
+      <w:proofErr w:type="spellStart"/>
+      <w:r>
+        <w:rPr>
+          <w:sz w:val="28"/>
+          <w:szCs w:val="28"/>
+        </w:rPr>
+        <w:t>đặc</w:t>
+      </w:r>
+      <w:proofErr w:type="spellEnd"/>
+      <w:r>
+        <w:rPr>
+          <w:sz w:val="28"/>
+          <w:szCs w:val="28"/>
+        </w:rPr>
+        <w:t xml:space="preserve"> </w:t>
+      </w:r>
+      <w:proofErr w:type="spellStart"/>
+      <w:r>
+        <w:rPr>
+          <w:sz w:val="28"/>
+          <w:szCs w:val="28"/>
+        </w:rPr>
+        <w:t>trưng</w:t>
+      </w:r>
+      <w:proofErr w:type="spellEnd"/>
     </w:p>
     <w:p/>
     <w:p>
@@ -543,6 +724,9 @@
         <w:tab/>
       </w:r>
       <w:r>
+        <w:rPr>
+          <w:noProof/>
+        </w:rPr>
         <w:drawing>
           <wp:inline distT="0" distB="0" distL="0" distR="0" wp14:anchorId="032C651A" wp14:editId="2336962E">
             <wp:extent cx="5943600" cy="3086100"/>
@@ -618,8 +802,143 @@
           <w:sz w:val="28"/>
           <w:szCs w:val="28"/>
         </w:rPr>
-        <w:t xml:space="preserve"> 3</w:t>
-      </w:r>
+        <w:t xml:space="preserve"> </w:t>
+      </w:r>
+      <w:r>
+        <w:rPr>
+          <w:sz w:val="28"/>
+          <w:szCs w:val="28"/>
+        </w:rPr>
+        <w:t>3</w:t>
+      </w:r>
+      <w:r>
+        <w:rPr>
+          <w:sz w:val="28"/>
+          <w:szCs w:val="28"/>
+        </w:rPr>
+        <w:t xml:space="preserve"> </w:t>
+      </w:r>
+      <w:proofErr w:type="spellStart"/>
+      <w:r>
+        <w:rPr>
+          <w:sz w:val="28"/>
+          <w:szCs w:val="28"/>
+        </w:rPr>
+        <w:t>Có</w:t>
+      </w:r>
+      <w:proofErr w:type="spellEnd"/>
+      <w:r>
+        <w:rPr>
+          <w:sz w:val="28"/>
+          <w:szCs w:val="28"/>
+        </w:rPr>
+        <w:t xml:space="preserve"> </w:t>
+      </w:r>
+      <w:proofErr w:type="spellStart"/>
+      <w:r>
+        <w:rPr>
+          <w:sz w:val="28"/>
+          <w:szCs w:val="28"/>
+        </w:rPr>
+        <w:t>sử</w:t>
+      </w:r>
+      <w:proofErr w:type="spellEnd"/>
+      <w:r>
+        <w:rPr>
+          <w:sz w:val="28"/>
+          <w:szCs w:val="28"/>
+        </w:rPr>
+        <w:t xml:space="preserve"> </w:t>
+      </w:r>
+      <w:proofErr w:type="spellStart"/>
+      <w:r>
+        <w:rPr>
+          <w:sz w:val="28"/>
+          <w:szCs w:val="28"/>
+        </w:rPr>
+        <w:t>dụng</w:t>
+      </w:r>
+      <w:proofErr w:type="spellEnd"/>
+      <w:r>
+        <w:rPr>
+          <w:sz w:val="28"/>
+          <w:szCs w:val="28"/>
+        </w:rPr>
+        <w:t xml:space="preserve"> PI </w:t>
+      </w:r>
+      <w:proofErr w:type="spellStart"/>
+      <w:r>
+        <w:rPr>
+          <w:sz w:val="28"/>
+          <w:szCs w:val="28"/>
+        </w:rPr>
+        <w:t>và</w:t>
+      </w:r>
+      <w:proofErr w:type="spellEnd"/>
+      <w:r>
+        <w:rPr>
+          <w:sz w:val="28"/>
+          <w:szCs w:val="28"/>
+        </w:rPr>
+        <w:t xml:space="preserve"> </w:t>
+      </w:r>
+      <w:proofErr w:type="spellStart"/>
+      <w:r>
+        <w:rPr>
+          <w:sz w:val="28"/>
+          <w:szCs w:val="28"/>
+        </w:rPr>
+        <w:t>loại</w:t>
+      </w:r>
+      <w:proofErr w:type="spellEnd"/>
+      <w:r>
+        <w:rPr>
+          <w:sz w:val="28"/>
+          <w:szCs w:val="28"/>
+        </w:rPr>
+        <w:t xml:space="preserve"> </w:t>
+      </w:r>
+      <w:proofErr w:type="spellStart"/>
+      <w:r>
+        <w:rPr>
+          <w:sz w:val="28"/>
+          <w:szCs w:val="28"/>
+        </w:rPr>
+        <w:t>bỏ</w:t>
+      </w:r>
+      <w:proofErr w:type="spellEnd"/>
+      <w:r>
+        <w:rPr>
+          <w:sz w:val="28"/>
+          <w:szCs w:val="28"/>
+        </w:rPr>
+        <w:t xml:space="preserve"> 15 </w:t>
+      </w:r>
+      <w:proofErr w:type="spellStart"/>
+      <w:r>
+        <w:rPr>
+          <w:sz w:val="28"/>
+          <w:szCs w:val="28"/>
+        </w:rPr>
+        <w:t>đặc</w:t>
+      </w:r>
+      <w:proofErr w:type="spellEnd"/>
+      <w:r>
+        <w:rPr>
+          <w:sz w:val="28"/>
+          <w:szCs w:val="28"/>
+        </w:rPr>
+        <w:t xml:space="preserve"> </w:t>
+      </w:r>
+      <w:proofErr w:type="spellStart"/>
+      <w:r>
+        <w:rPr>
+          <w:sz w:val="28"/>
+          <w:szCs w:val="28"/>
+        </w:rPr>
+        <w:t>trưng</w:t>
+      </w:r>
+      <w:proofErr w:type="spellEnd"/>
     </w:p>
     <w:p/>
     <w:p>
@@ -5190,6 +5509,866 @@
         <w:t>.</w:t>
       </w:r>
     </w:p>
+    <w:p>
+      <w:pPr>
+        <w:ind w:left="360"/>
+        <w:rPr>
+          <w:b/>
+          <w:bCs/>
+        </w:rPr>
+      </w:pPr>
+      <w:r>
+        <w:t>d.</w:t>
+      </w:r>
+      <w:r>
+        <w:rPr>
+          <w:rFonts w:ascii="Times New Roman" w:eastAsia="Times New Roman" w:hAnsi="Times New Roman" w:cs="Times New Roman"/>
+          <w:b/>
+          <w:bCs/>
+          <w:kern w:val="0"/>
+          <w:sz w:val="27"/>
+          <w:szCs w:val="27"/>
+          <w14:ligatures w14:val="none"/>
+        </w:rPr>
+        <w:t xml:space="preserve"> </w:t>
+      </w:r>
+      <w:proofErr w:type="spellStart"/>
+      <w:r>
+        <w:t>Sự</w:t>
+      </w:r>
+      <w:proofErr w:type="spellEnd"/>
+      <w:r>
+        <w:t xml:space="preserve"> </w:t>
+      </w:r>
+      <w:proofErr w:type="spellStart"/>
+      <w:r>
+        <w:t>đối</w:t>
+      </w:r>
+      <w:proofErr w:type="spellEnd"/>
+      <w:r>
+        <w:t xml:space="preserve"> </w:t>
+      </w:r>
+      <w:proofErr w:type="spellStart"/>
+      <w:r>
+        <w:t>lập</w:t>
+      </w:r>
+      <w:proofErr w:type="spellEnd"/>
+      <w:r>
+        <w:t xml:space="preserve"> </w:t>
+      </w:r>
+      <w:proofErr w:type="spellStart"/>
+      <w:r>
+        <w:t>giữa</w:t>
+      </w:r>
+      <w:proofErr w:type="spellEnd"/>
+      <w:r>
+        <w:t xml:space="preserve"> </w:t>
+      </w:r>
+      <w:proofErr w:type="spellStart"/>
+      <w:r>
+        <w:t>tập</w:t>
+      </w:r>
+      <w:proofErr w:type="spellEnd"/>
+      <w:r>
+        <w:t xml:space="preserve"> Validation </w:t>
+      </w:r>
+      <w:proofErr w:type="spellStart"/>
+      <w:r>
+        <w:t>và</w:t>
+      </w:r>
+      <w:proofErr w:type="spellEnd"/>
+      <w:r>
+        <w:t xml:space="preserve"> </w:t>
+      </w:r>
+      <w:proofErr w:type="spellStart"/>
+      <w:r>
+        <w:t>tập</w:t>
+      </w:r>
+      <w:proofErr w:type="spellEnd"/>
+      <w:r>
+        <w:t xml:space="preserve"> Test</w:t>
+      </w:r>
+    </w:p>
+    <w:p>
+      <w:pPr>
+        <w:numPr>
+          <w:ilvl w:val="0"/>
+          <w:numId w:val="13"/>
+        </w:numPr>
+      </w:pPr>
+      <w:proofErr w:type="spellStart"/>
+      <w:r>
+        <w:t>Trên</w:t>
+      </w:r>
+      <w:proofErr w:type="spellEnd"/>
+      <w:r>
+        <w:t xml:space="preserve"> </w:t>
+      </w:r>
+      <w:proofErr w:type="spellStart"/>
+      <w:r>
+        <w:t>tập</w:t>
+      </w:r>
+      <w:proofErr w:type="spellEnd"/>
+      <w:r>
+        <w:t xml:space="preserve"> Validation, </w:t>
+      </w:r>
+      <w:proofErr w:type="spellStart"/>
+      <w:r>
+        <w:t>mô</w:t>
+      </w:r>
+      <w:proofErr w:type="spellEnd"/>
+      <w:r>
+        <w:t xml:space="preserve"> </w:t>
+      </w:r>
+      <w:proofErr w:type="spellStart"/>
+      <w:r>
+        <w:t>hình</w:t>
+      </w:r>
+      <w:proofErr w:type="spellEnd"/>
+      <w:r>
+        <w:t xml:space="preserve"> </w:t>
+      </w:r>
+      <w:proofErr w:type="spellStart"/>
+      <w:r>
+        <w:t>Không</w:t>
+      </w:r>
+      <w:proofErr w:type="spellEnd"/>
+      <w:r>
+        <w:t xml:space="preserve"> PI (35 features) </w:t>
+      </w:r>
+      <w:proofErr w:type="spellStart"/>
+      <w:r>
+        <w:t>có</w:t>
+      </w:r>
+      <w:proofErr w:type="spellEnd"/>
+      <w:r>
+        <w:t xml:space="preserve"> RMSE </w:t>
+      </w:r>
+      <w:proofErr w:type="spellStart"/>
+      <w:r>
+        <w:t>tốt</w:t>
+      </w:r>
+      <w:proofErr w:type="spellEnd"/>
+      <w:r>
+        <w:t xml:space="preserve"> </w:t>
+      </w:r>
+      <w:proofErr w:type="spellStart"/>
+      <w:r>
+        <w:t>nhất</w:t>
+      </w:r>
+      <w:proofErr w:type="spellEnd"/>
+      <w:r>
+        <w:t xml:space="preserve"> (1.1802), </w:t>
+      </w:r>
+      <w:proofErr w:type="spellStart"/>
+      <w:r>
+        <w:t>nhỉnh</w:t>
+      </w:r>
+      <w:proofErr w:type="spellEnd"/>
+      <w:r>
+        <w:t xml:space="preserve"> </w:t>
+      </w:r>
+      <w:proofErr w:type="spellStart"/>
+      <w:r>
+        <w:t>hơn</w:t>
+      </w:r>
+      <w:proofErr w:type="spellEnd"/>
+      <w:r>
+        <w:t xml:space="preserve"> </w:t>
+      </w:r>
+      <w:proofErr w:type="spellStart"/>
+      <w:r>
+        <w:t>mô</w:t>
+      </w:r>
+      <w:proofErr w:type="spellEnd"/>
+      <w:r>
+        <w:t xml:space="preserve"> </w:t>
+      </w:r>
+      <w:proofErr w:type="spellStart"/>
+      <w:r>
+        <w:t>hình</w:t>
+      </w:r>
+      <w:proofErr w:type="spellEnd"/>
+      <w:r>
+        <w:t xml:space="preserve"> </w:t>
+      </w:r>
+      <w:proofErr w:type="spellStart"/>
+      <w:r>
+        <w:t>Bỏ</w:t>
+      </w:r>
+      <w:proofErr w:type="spellEnd"/>
+      <w:r>
+        <w:t xml:space="preserve"> 15 features (1.1819).</w:t>
+      </w:r>
+    </w:p>
+    <w:p>
+      <w:pPr>
+        <w:numPr>
+          <w:ilvl w:val="0"/>
+          <w:numId w:val="13"/>
+        </w:numPr>
+      </w:pPr>
+      <w:proofErr w:type="spellStart"/>
+      <w:r>
+        <w:t>Nhưng</w:t>
+      </w:r>
+      <w:proofErr w:type="spellEnd"/>
+      <w:r>
+        <w:t xml:space="preserve"> </w:t>
+      </w:r>
+      <w:proofErr w:type="spellStart"/>
+      <w:r>
+        <w:t>khi</w:t>
+      </w:r>
+      <w:proofErr w:type="spellEnd"/>
+      <w:r>
+        <w:t xml:space="preserve"> </w:t>
+      </w:r>
+      <w:proofErr w:type="spellStart"/>
+      <w:r>
+        <w:t>chấm</w:t>
+      </w:r>
+      <w:proofErr w:type="spellEnd"/>
+      <w:r>
+        <w:t xml:space="preserve"> </w:t>
+      </w:r>
+      <w:proofErr w:type="spellStart"/>
+      <w:r>
+        <w:t>điểm</w:t>
+      </w:r>
+      <w:proofErr w:type="spellEnd"/>
+      <w:r>
+        <w:t xml:space="preserve"> </w:t>
+      </w:r>
+      <w:proofErr w:type="spellStart"/>
+      <w:r>
+        <w:t>trên</w:t>
+      </w:r>
+      <w:proofErr w:type="spellEnd"/>
+      <w:r>
+        <w:t xml:space="preserve"> </w:t>
+      </w:r>
+      <w:proofErr w:type="spellStart"/>
+      <w:r>
+        <w:t>tập</w:t>
+      </w:r>
+      <w:proofErr w:type="spellEnd"/>
+      <w:r>
+        <w:t xml:space="preserve"> Test, </w:t>
+      </w:r>
+      <w:proofErr w:type="spellStart"/>
+      <w:r>
+        <w:t>mô</w:t>
+      </w:r>
+      <w:proofErr w:type="spellEnd"/>
+      <w:r>
+        <w:t xml:space="preserve"> </w:t>
+      </w:r>
+      <w:proofErr w:type="spellStart"/>
+      <w:r>
+        <w:t>hình</w:t>
+      </w:r>
+      <w:proofErr w:type="spellEnd"/>
+      <w:r>
+        <w:t xml:space="preserve"> </w:t>
+      </w:r>
+      <w:proofErr w:type="spellStart"/>
+      <w:r>
+        <w:t>Bỏ</w:t>
+      </w:r>
+      <w:proofErr w:type="spellEnd"/>
+      <w:r>
+        <w:t xml:space="preserve"> 15 features </w:t>
+      </w:r>
+      <w:proofErr w:type="spellStart"/>
+      <w:r>
+        <w:t>lại</w:t>
+      </w:r>
+      <w:proofErr w:type="spellEnd"/>
+      <w:r>
+        <w:t xml:space="preserve"> </w:t>
+      </w:r>
+      <w:proofErr w:type="spellStart"/>
+      <w:r>
+        <w:t>lật</w:t>
+      </w:r>
+      <w:proofErr w:type="spellEnd"/>
+      <w:r>
+        <w:t xml:space="preserve"> </w:t>
+      </w:r>
+      <w:proofErr w:type="spellStart"/>
+      <w:r>
+        <w:t>ngược</w:t>
+      </w:r>
+      <w:proofErr w:type="spellEnd"/>
+      <w:r>
+        <w:t xml:space="preserve"> </w:t>
+      </w:r>
+      <w:proofErr w:type="spellStart"/>
+      <w:r>
+        <w:t>tình</w:t>
+      </w:r>
+      <w:proofErr w:type="spellEnd"/>
+      <w:r>
+        <w:t xml:space="preserve"> </w:t>
+      </w:r>
+      <w:proofErr w:type="spellStart"/>
+      <w:r>
+        <w:t>thế</w:t>
+      </w:r>
+      <w:proofErr w:type="spellEnd"/>
+      <w:r>
+        <w:t xml:space="preserve"> </w:t>
+      </w:r>
+      <w:proofErr w:type="spellStart"/>
+      <w:r>
+        <w:t>và</w:t>
+      </w:r>
+      <w:proofErr w:type="spellEnd"/>
+      <w:r>
+        <w:t xml:space="preserve"> </w:t>
+      </w:r>
+      <w:proofErr w:type="spellStart"/>
+      <w:r>
+        <w:t>thắng</w:t>
+      </w:r>
+      <w:proofErr w:type="spellEnd"/>
+      <w:r>
+        <w:t xml:space="preserve"> </w:t>
+      </w:r>
+      <w:proofErr w:type="spellStart"/>
+      <w:r>
+        <w:t>áp</w:t>
+      </w:r>
+      <w:proofErr w:type="spellEnd"/>
+      <w:r>
+        <w:t xml:space="preserve"> </w:t>
+      </w:r>
+      <w:proofErr w:type="spellStart"/>
+      <w:r>
+        <w:t>đảo</w:t>
+      </w:r>
+      <w:proofErr w:type="spellEnd"/>
+      <w:r>
+        <w:t xml:space="preserve"> (1.1782 so </w:t>
+      </w:r>
+      <w:proofErr w:type="spellStart"/>
+      <w:r>
+        <w:t>với</w:t>
+      </w:r>
+      <w:proofErr w:type="spellEnd"/>
+      <w:r>
+        <w:t xml:space="preserve"> 1.1834).</w:t>
+      </w:r>
+    </w:p>
+    <w:p>
+      <w:pPr>
+        <w:ind w:left="360"/>
+      </w:pPr>
+      <w:r>
+        <w:rPr>
+          <w:b/>
+          <w:bCs/>
+        </w:rPr>
+        <w:t xml:space="preserve">=&gt; </w:t>
+      </w:r>
+      <w:proofErr w:type="spellStart"/>
+      <w:r>
+        <w:t>M</w:t>
+      </w:r>
+      <w:r>
+        <w:t>ô</w:t>
+      </w:r>
+      <w:proofErr w:type="spellEnd"/>
+      <w:r>
+        <w:t xml:space="preserve"> </w:t>
+      </w:r>
+      <w:proofErr w:type="spellStart"/>
+      <w:r>
+        <w:t>hình</w:t>
+      </w:r>
+      <w:proofErr w:type="spellEnd"/>
+      <w:r>
+        <w:t xml:space="preserve"> </w:t>
+      </w:r>
+      <w:proofErr w:type="spellStart"/>
+      <w:r>
+        <w:t>có</w:t>
+      </w:r>
+      <w:proofErr w:type="spellEnd"/>
+      <w:r>
+        <w:t xml:space="preserve"> </w:t>
+      </w:r>
+      <w:proofErr w:type="spellStart"/>
+      <w:r>
+        <w:t>quá</w:t>
+      </w:r>
+      <w:proofErr w:type="spellEnd"/>
+      <w:r>
+        <w:t xml:space="preserve"> </w:t>
+      </w:r>
+      <w:proofErr w:type="spellStart"/>
+      <w:r>
+        <w:t>nhiều</w:t>
+      </w:r>
+      <w:proofErr w:type="spellEnd"/>
+      <w:r>
+        <w:t xml:space="preserve"> </w:t>
+      </w:r>
+      <w:proofErr w:type="spellStart"/>
+      <w:r>
+        <w:t>đặc</w:t>
+      </w:r>
+      <w:proofErr w:type="spellEnd"/>
+      <w:r>
+        <w:t xml:space="preserve"> </w:t>
+      </w:r>
+      <w:proofErr w:type="spellStart"/>
+      <w:r>
+        <w:t>trưng</w:t>
+      </w:r>
+      <w:proofErr w:type="spellEnd"/>
+      <w:r>
+        <w:t xml:space="preserve"> (35 features) </w:t>
+      </w:r>
+      <w:proofErr w:type="spellStart"/>
+      <w:r>
+        <w:t>bắt</w:t>
+      </w:r>
+      <w:proofErr w:type="spellEnd"/>
+      <w:r>
+        <w:t xml:space="preserve"> </w:t>
+      </w:r>
+      <w:proofErr w:type="spellStart"/>
+      <w:r>
+        <w:t>đầu</w:t>
+      </w:r>
+      <w:proofErr w:type="spellEnd"/>
+      <w:r>
+        <w:t xml:space="preserve"> </w:t>
+      </w:r>
+      <w:proofErr w:type="spellStart"/>
+      <w:r>
+        <w:t>có</w:t>
+      </w:r>
+      <w:proofErr w:type="spellEnd"/>
+      <w:r>
+        <w:t xml:space="preserve"> xu </w:t>
+      </w:r>
+      <w:proofErr w:type="spellStart"/>
+      <w:r>
+        <w:t>hướng</w:t>
+      </w:r>
+      <w:proofErr w:type="spellEnd"/>
+      <w:r>
+        <w:t xml:space="preserve"> Overfit </w:t>
+      </w:r>
+      <w:proofErr w:type="spellStart"/>
+      <w:r>
+        <w:t>nhẹ</w:t>
+      </w:r>
+      <w:proofErr w:type="spellEnd"/>
+      <w:r>
+        <w:t xml:space="preserve"> </w:t>
+      </w:r>
+      <w:proofErr w:type="spellStart"/>
+      <w:r>
+        <w:t>vào</w:t>
+      </w:r>
+      <w:proofErr w:type="spellEnd"/>
+      <w:r>
+        <w:t xml:space="preserve"> </w:t>
+      </w:r>
+      <w:proofErr w:type="spellStart"/>
+      <w:r>
+        <w:t>tập</w:t>
+      </w:r>
+      <w:proofErr w:type="spellEnd"/>
+      <w:r>
+        <w:t xml:space="preserve"> Validation (</w:t>
+      </w:r>
+      <w:proofErr w:type="spellStart"/>
+      <w:r>
+        <w:t>nó</w:t>
+      </w:r>
+      <w:proofErr w:type="spellEnd"/>
+      <w:r>
+        <w:t xml:space="preserve"> </w:t>
+      </w:r>
+      <w:proofErr w:type="spellStart"/>
+      <w:r>
+        <w:t>vô</w:t>
+      </w:r>
+      <w:proofErr w:type="spellEnd"/>
+      <w:r>
+        <w:t xml:space="preserve"> </w:t>
+      </w:r>
+      <w:proofErr w:type="spellStart"/>
+      <w:r>
+        <w:t>tình</w:t>
+      </w:r>
+      <w:proofErr w:type="spellEnd"/>
+      <w:r>
+        <w:t xml:space="preserve"> </w:t>
+      </w:r>
+      <w:proofErr w:type="spellStart"/>
+      <w:r>
+        <w:t>dùng</w:t>
+      </w:r>
+      <w:proofErr w:type="spellEnd"/>
+      <w:r>
+        <w:t xml:space="preserve"> </w:t>
+      </w:r>
+      <w:proofErr w:type="spellStart"/>
+      <w:r>
+        <w:t>các</w:t>
+      </w:r>
+      <w:proofErr w:type="spellEnd"/>
+      <w:r>
+        <w:t xml:space="preserve"> </w:t>
+      </w:r>
+      <w:proofErr w:type="spellStart"/>
+      <w:r>
+        <w:t>đặc</w:t>
+      </w:r>
+      <w:proofErr w:type="spellEnd"/>
+      <w:r>
+        <w:t xml:space="preserve"> </w:t>
+      </w:r>
+      <w:proofErr w:type="spellStart"/>
+      <w:r>
+        <w:t>trưng</w:t>
+      </w:r>
+      <w:proofErr w:type="spellEnd"/>
+      <w:r>
+        <w:t xml:space="preserve"> </w:t>
+      </w:r>
+      <w:proofErr w:type="spellStart"/>
+      <w:r>
+        <w:t>nhiễu</w:t>
+      </w:r>
+      <w:proofErr w:type="spellEnd"/>
+      <w:r>
+        <w:t xml:space="preserve"> </w:t>
+      </w:r>
+      <w:proofErr w:type="spellStart"/>
+      <w:r>
+        <w:t>để</w:t>
+      </w:r>
+      <w:proofErr w:type="spellEnd"/>
+      <w:r>
+        <w:t xml:space="preserve"> </w:t>
+      </w:r>
+      <w:proofErr w:type="spellStart"/>
+      <w:r>
+        <w:t>tối</w:t>
+      </w:r>
+      <w:proofErr w:type="spellEnd"/>
+      <w:r>
+        <w:t xml:space="preserve"> </w:t>
+      </w:r>
+      <w:proofErr w:type="spellStart"/>
+      <w:r>
+        <w:t>ưu</w:t>
+      </w:r>
+      <w:proofErr w:type="spellEnd"/>
+      <w:r>
+        <w:t xml:space="preserve"> </w:t>
+      </w:r>
+      <w:proofErr w:type="spellStart"/>
+      <w:r>
+        <w:t>hóa</w:t>
+      </w:r>
+      <w:proofErr w:type="spellEnd"/>
+      <w:r>
+        <w:t xml:space="preserve"> </w:t>
+      </w:r>
+      <w:proofErr w:type="spellStart"/>
+      <w:r>
+        <w:t>riêng</w:t>
+      </w:r>
+      <w:proofErr w:type="spellEnd"/>
+      <w:r>
+        <w:t xml:space="preserve"> </w:t>
+      </w:r>
+      <w:proofErr w:type="spellStart"/>
+      <w:r>
+        <w:t>cho</w:t>
+      </w:r>
+      <w:proofErr w:type="spellEnd"/>
+      <w:r>
+        <w:t xml:space="preserve"> </w:t>
+      </w:r>
+      <w:proofErr w:type="spellStart"/>
+      <w:r>
+        <w:t>tập</w:t>
+      </w:r>
+      <w:proofErr w:type="spellEnd"/>
+      <w:r>
+        <w:t xml:space="preserve"> Val). </w:t>
+      </w:r>
+      <w:proofErr w:type="spellStart"/>
+      <w:r>
+        <w:t>Nhờ</w:t>
+      </w:r>
+      <w:proofErr w:type="spellEnd"/>
+      <w:r>
+        <w:t xml:space="preserve"> </w:t>
+      </w:r>
+      <w:proofErr w:type="spellStart"/>
+      <w:r>
+        <w:t>áp</w:t>
+      </w:r>
+      <w:proofErr w:type="spellEnd"/>
+      <w:r>
+        <w:t xml:space="preserve"> </w:t>
+      </w:r>
+      <w:proofErr w:type="spellStart"/>
+      <w:r>
+        <w:t>dụng</w:t>
+      </w:r>
+      <w:proofErr w:type="spellEnd"/>
+      <w:r>
+        <w:t xml:space="preserve"> Permutation Importance (</w:t>
+      </w:r>
+      <w:proofErr w:type="spellStart"/>
+      <w:r>
+        <w:t>bỏ</w:t>
+      </w:r>
+      <w:proofErr w:type="spellEnd"/>
+      <w:r>
+        <w:t xml:space="preserve"> 15 </w:t>
+      </w:r>
+      <w:proofErr w:type="spellStart"/>
+      <w:r>
+        <w:t>đặc</w:t>
+      </w:r>
+      <w:proofErr w:type="spellEnd"/>
+      <w:r>
+        <w:t xml:space="preserve"> </w:t>
+      </w:r>
+      <w:proofErr w:type="spellStart"/>
+      <w:r>
+        <w:t>trưng</w:t>
+      </w:r>
+      <w:proofErr w:type="spellEnd"/>
+      <w:r>
+        <w:t xml:space="preserve"> </w:t>
+      </w:r>
+      <w:proofErr w:type="spellStart"/>
+      <w:r>
+        <w:t>nhiễu</w:t>
+      </w:r>
+      <w:proofErr w:type="spellEnd"/>
+      <w:r>
+        <w:t xml:space="preserve">), </w:t>
+      </w:r>
+      <w:proofErr w:type="spellStart"/>
+      <w:r>
+        <w:t>mô</w:t>
+      </w:r>
+      <w:proofErr w:type="spellEnd"/>
+      <w:r>
+        <w:t xml:space="preserve"> </w:t>
+      </w:r>
+      <w:proofErr w:type="spellStart"/>
+      <w:r>
+        <w:t>hình</w:t>
+      </w:r>
+      <w:proofErr w:type="spellEnd"/>
+      <w:r>
+        <w:t xml:space="preserve"> </w:t>
+      </w:r>
+      <w:proofErr w:type="spellStart"/>
+      <w:r>
+        <w:t>thứ</w:t>
+      </w:r>
+      <w:proofErr w:type="spellEnd"/>
+      <w:r>
+        <w:t xml:space="preserve"> 3 </w:t>
+      </w:r>
+      <w:proofErr w:type="spellStart"/>
+      <w:r>
+        <w:t>loại</w:t>
+      </w:r>
+      <w:proofErr w:type="spellEnd"/>
+      <w:r>
+        <w:t xml:space="preserve"> </w:t>
+      </w:r>
+      <w:proofErr w:type="spellStart"/>
+      <w:r>
+        <w:t>bỏ</w:t>
+      </w:r>
+      <w:proofErr w:type="spellEnd"/>
+      <w:r>
+        <w:t xml:space="preserve"> </w:t>
+      </w:r>
+      <w:proofErr w:type="spellStart"/>
+      <w:r>
+        <w:t>khả</w:t>
+      </w:r>
+      <w:proofErr w:type="spellEnd"/>
+      <w:r>
+        <w:t xml:space="preserve"> </w:t>
+      </w:r>
+      <w:proofErr w:type="spellStart"/>
+      <w:r>
+        <w:t>năng</w:t>
+      </w:r>
+      <w:proofErr w:type="spellEnd"/>
+      <w:r>
+        <w:t xml:space="preserve"> </w:t>
+      </w:r>
+      <w:proofErr w:type="spellStart"/>
+      <w:r>
+        <w:t>học</w:t>
+      </w:r>
+      <w:proofErr w:type="spellEnd"/>
+      <w:r>
+        <w:t xml:space="preserve"> </w:t>
+      </w:r>
+      <w:proofErr w:type="spellStart"/>
+      <w:r>
+        <w:t>vẹt</w:t>
+      </w:r>
+      <w:proofErr w:type="spellEnd"/>
+      <w:r>
+        <w:t xml:space="preserve"> </w:t>
+      </w:r>
+      <w:proofErr w:type="spellStart"/>
+      <w:r>
+        <w:t>này</w:t>
+      </w:r>
+      <w:proofErr w:type="spellEnd"/>
+      <w:r>
+        <w:t xml:space="preserve">, </w:t>
+      </w:r>
+      <w:proofErr w:type="spellStart"/>
+      <w:r>
+        <w:t>giúp</w:t>
+      </w:r>
+      <w:proofErr w:type="spellEnd"/>
+      <w:r>
+        <w:t xml:space="preserve"> </w:t>
+      </w:r>
+      <w:proofErr w:type="spellStart"/>
+      <w:r>
+        <w:t>nó</w:t>
+      </w:r>
+      <w:proofErr w:type="spellEnd"/>
+      <w:r>
+        <w:t xml:space="preserve"> </w:t>
+      </w:r>
+      <w:proofErr w:type="spellStart"/>
+      <w:r>
+        <w:t>khái</w:t>
+      </w:r>
+      <w:proofErr w:type="spellEnd"/>
+      <w:r>
+        <w:t xml:space="preserve"> </w:t>
+      </w:r>
+      <w:proofErr w:type="spellStart"/>
+      <w:r>
+        <w:t>quát</w:t>
+      </w:r>
+      <w:proofErr w:type="spellEnd"/>
+      <w:r>
+        <w:t xml:space="preserve"> </w:t>
+      </w:r>
+      <w:proofErr w:type="spellStart"/>
+      <w:r>
+        <w:t>hóa</w:t>
+      </w:r>
+      <w:proofErr w:type="spellEnd"/>
+      <w:r>
+        <w:t xml:space="preserve"> (generalize) </w:t>
+      </w:r>
+      <w:proofErr w:type="spellStart"/>
+      <w:r>
+        <w:t>xuất</w:t>
+      </w:r>
+      <w:proofErr w:type="spellEnd"/>
+      <w:r>
+        <w:t xml:space="preserve"> </w:t>
+      </w:r>
+      <w:proofErr w:type="spellStart"/>
+      <w:r>
+        <w:t>sắc</w:t>
+      </w:r>
+      <w:proofErr w:type="spellEnd"/>
+      <w:r>
+        <w:t xml:space="preserve"> </w:t>
+      </w:r>
+      <w:proofErr w:type="spellStart"/>
+      <w:r>
+        <w:t>trên</w:t>
+      </w:r>
+      <w:proofErr w:type="spellEnd"/>
+      <w:r>
+        <w:t xml:space="preserve"> </w:t>
+      </w:r>
+      <w:proofErr w:type="spellStart"/>
+      <w:r>
+        <w:t>một</w:t>
+      </w:r>
+      <w:proofErr w:type="spellEnd"/>
+      <w:r>
+        <w:t xml:space="preserve"> </w:t>
+      </w:r>
+      <w:proofErr w:type="spellStart"/>
+      <w:r>
+        <w:t>tập</w:t>
+      </w:r>
+      <w:proofErr w:type="spellEnd"/>
+      <w:r>
+        <w:t xml:space="preserve"> </w:t>
+      </w:r>
+      <w:proofErr w:type="spellStart"/>
+      <w:r>
+        <w:t>dữ</w:t>
+      </w:r>
+      <w:proofErr w:type="spellEnd"/>
+      <w:r>
+        <w:t xml:space="preserve"> </w:t>
+      </w:r>
+      <w:proofErr w:type="spellStart"/>
+      <w:r>
+        <w:t>liệu</w:t>
+      </w:r>
+      <w:proofErr w:type="spellEnd"/>
+      <w:r>
+        <w:t xml:space="preserve"> </w:t>
+      </w:r>
+      <w:proofErr w:type="spellStart"/>
+      <w:r>
+        <w:t>hoàn</w:t>
+      </w:r>
+      <w:proofErr w:type="spellEnd"/>
+      <w:r>
+        <w:t xml:space="preserve"> </w:t>
+      </w:r>
+      <w:proofErr w:type="spellStart"/>
+      <w:r>
+        <w:t>toàn</w:t>
+      </w:r>
+      <w:proofErr w:type="spellEnd"/>
+      <w:r>
+        <w:t xml:space="preserve"> xa </w:t>
+      </w:r>
+      <w:proofErr w:type="spellStart"/>
+      <w:r>
+        <w:t>lạ</w:t>
+      </w:r>
+      <w:proofErr w:type="spellEnd"/>
+      <w:r>
+        <w:t xml:space="preserve"> (Test Set).</w:t>
+      </w:r>
+    </w:p>
+    <w:p>
+      <w:pPr>
+        <w:ind w:left="360"/>
+      </w:pPr>
+    </w:p>
     <w:p/>
     <w:sectPr>
       <w:pgSz w:w="12240" w:h="15840"/>
@@ -6360,6 +7539,155 @@
     </w:lvl>
   </w:abstractNum>
   <w:abstractNum w:abstractNumId="8" w15:restartNumberingAfterBreak="0">
+    <w:nsid w:val="5B726243"/>
+    <w:multiLevelType w:val="multilevel"/>
+    <w:tmpl w:val="C5643ECC"/>
+    <w:lvl w:ilvl="0">
+      <w:start w:val="1"/>
+      <w:numFmt w:val="bullet"/>
+      <w:lvlText w:val=""/>
+      <w:lvlJc w:val="left"/>
+      <w:pPr>
+        <w:tabs>
+          <w:tab w:val="num" w:pos="720"/>
+        </w:tabs>
+        <w:ind w:left="720" w:hanging="360"/>
+      </w:pPr>
+      <w:rPr>
+        <w:rFonts w:ascii="Symbol" w:hAnsi="Symbol" w:hint="default"/>
+        <w:sz w:val="20"/>
+      </w:rPr>
+    </w:lvl>
+    <w:lvl w:ilvl="1" w:tentative="1">
+      <w:start w:val="1"/>
+      <w:numFmt w:val="bullet"/>
+      <w:lvlText w:val="o"/>
+      <w:lvlJc w:val="left"/>
+      <w:pPr>
+        <w:tabs>
+          <w:tab w:val="num" w:pos="1440"/>
+        </w:tabs>
+        <w:ind w:left="1440" w:hanging="360"/>
+      </w:pPr>
+      <w:rPr>
+        <w:rFonts w:ascii="Courier New" w:hAnsi="Courier New" w:hint="default"/>
+        <w:sz w:val="20"/>
+      </w:rPr>
+    </w:lvl>
+    <w:lvl w:ilvl="2" w:tentative="1">
+      <w:start w:val="1"/>
+      <w:numFmt w:val="bullet"/>
+      <w:lvlText w:val=""/>
+      <w:lvlJc w:val="left"/>
+      <w:pPr>
+        <w:tabs>
+          <w:tab w:val="num" w:pos="2160"/>
+        </w:tabs>
+        <w:ind w:left="2160" w:hanging="360"/>
+      </w:pPr>
+      <w:rPr>
+        <w:rFonts w:ascii="Wingdings" w:hAnsi="Wingdings" w:hint="default"/>
+        <w:sz w:val="20"/>
+      </w:rPr>
+    </w:lvl>
+    <w:lvl w:ilvl="3" w:tentative="1">
+      <w:start w:val="1"/>
+      <w:numFmt w:val="bullet"/>
+      <w:lvlText w:val=""/>
+      <w:lvlJc w:val="left"/>
+      <w:pPr>
+        <w:tabs>
+          <w:tab w:val="num" w:pos="2880"/>
+        </w:tabs>
+        <w:ind w:left="2880" w:hanging="360"/>
+      </w:pPr>
+      <w:rPr>
+        <w:rFonts w:ascii="Wingdings" w:hAnsi="Wingdings" w:hint="default"/>
+        <w:sz w:val="20"/>
+      </w:rPr>
+    </w:lvl>
+    <w:lvl w:ilvl="4" w:tentative="1">
+      <w:start w:val="1"/>
+      <w:numFmt w:val="bullet"/>
+      <w:lvlText w:val=""/>
+      <w:lvlJc w:val="left"/>
+      <w:pPr>
+        <w:tabs>
+          <w:tab w:val="num" w:pos="3600"/>
+        </w:tabs>
+        <w:ind w:left="3600" w:hanging="360"/>
+      </w:pPr>
+      <w:rPr>
+        <w:rFonts w:ascii="Wingdings" w:hAnsi="Wingdings" w:hint="default"/>
+        <w:sz w:val="20"/>
+      </w:rPr>
+    </w:lvl>
+    <w:lvl w:ilvl="5" w:tentative="1">
+      <w:start w:val="1"/>
+      <w:numFmt w:val="bullet"/>
+      <w:lvlText w:val=""/>
+      <w:lvlJc w:val="left"/>
+      <w:pPr>
+        <w:tabs>
+          <w:tab w:val="num" w:pos="4320"/>
+        </w:tabs>
+        <w:ind w:left="4320" w:hanging="360"/>
+      </w:pPr>
+      <w:rPr>
+        <w:rFonts w:ascii="Wingdings" w:hAnsi="Wingdings" w:hint="default"/>
+        <w:sz w:val="20"/>
+      </w:rPr>
+    </w:lvl>
+    <w:lvl w:ilvl="6" w:tentative="1">
+      <w:start w:val="1"/>
+      <w:numFmt w:val="bullet"/>
+      <w:lvlText w:val=""/>
+      <w:lvlJc w:val="left"/>
+      <w:pPr>
+        <w:tabs>
+          <w:tab w:val="num" w:pos="5040"/>
+        </w:tabs>
+        <w:ind w:left="5040" w:hanging="360"/>
+      </w:pPr>
+      <w:rPr>
+        <w:rFonts w:ascii="Wingdings" w:hAnsi="Wingdings" w:hint="default"/>
+        <w:sz w:val="20"/>
+      </w:rPr>
+    </w:lvl>
+    <w:lvl w:ilvl="7" w:tentative="1">
+      <w:start w:val="1"/>
+      <w:numFmt w:val="bullet"/>
+      <w:lvlText w:val=""/>
+      <w:lvlJc w:val="left"/>
+      <w:pPr>
+        <w:tabs>
+          <w:tab w:val="num" w:pos="5760"/>
+        </w:tabs>
+        <w:ind w:left="5760" w:hanging="360"/>
+      </w:pPr>
+      <w:rPr>
+        <w:rFonts w:ascii="Wingdings" w:hAnsi="Wingdings" w:hint="default"/>
+        <w:sz w:val="20"/>
+      </w:rPr>
+    </w:lvl>
+    <w:lvl w:ilvl="8" w:tentative="1">
+      <w:start w:val="1"/>
+      <w:numFmt w:val="bullet"/>
+      <w:lvlText w:val=""/>
+      <w:lvlJc w:val="left"/>
+      <w:pPr>
+        <w:tabs>
+          <w:tab w:val="num" w:pos="6480"/>
+        </w:tabs>
+        <w:ind w:left="6480" w:hanging="360"/>
+      </w:pPr>
+      <w:rPr>
+        <w:rFonts w:ascii="Wingdings" w:hAnsi="Wingdings" w:hint="default"/>
+        <w:sz w:val="20"/>
+      </w:rPr>
+    </w:lvl>
+  </w:abstractNum>
+  <w:abstractNum w:abstractNumId="9" w15:restartNumberingAfterBreak="0">
     <w:nsid w:val="772524FD"/>
     <w:multiLevelType w:val="multilevel"/>
     <w:tmpl w:val="E63A03EA"/>
@@ -6508,7 +7836,156 @@
       </w:rPr>
     </w:lvl>
   </w:abstractNum>
-  <w:abstractNum w:abstractNumId="9" w15:restartNumberingAfterBreak="0">
+  <w:abstractNum w:abstractNumId="10" w15:restartNumberingAfterBreak="0">
+    <w:nsid w:val="7A0B39FB"/>
+    <w:multiLevelType w:val="multilevel"/>
+    <w:tmpl w:val="88CEAB9C"/>
+    <w:lvl w:ilvl="0">
+      <w:start w:val="1"/>
+      <w:numFmt w:val="bullet"/>
+      <w:lvlText w:val="o"/>
+      <w:lvlJc w:val="left"/>
+      <w:pPr>
+        <w:tabs>
+          <w:tab w:val="num" w:pos="720"/>
+        </w:tabs>
+        <w:ind w:left="720" w:hanging="360"/>
+      </w:pPr>
+      <w:rPr>
+        <w:rFonts w:ascii="Courier New" w:hAnsi="Courier New" w:cs="Courier New" w:hint="default"/>
+        <w:sz w:val="20"/>
+      </w:rPr>
+    </w:lvl>
+    <w:lvl w:ilvl="1" w:tentative="1">
+      <w:start w:val="1"/>
+      <w:numFmt w:val="bullet"/>
+      <w:lvlText w:val="o"/>
+      <w:lvlJc w:val="left"/>
+      <w:pPr>
+        <w:tabs>
+          <w:tab w:val="num" w:pos="1440"/>
+        </w:tabs>
+        <w:ind w:left="1440" w:hanging="360"/>
+      </w:pPr>
+      <w:rPr>
+        <w:rFonts w:ascii="Courier New" w:hAnsi="Courier New" w:hint="default"/>
+        <w:sz w:val="20"/>
+      </w:rPr>
+    </w:lvl>
+    <w:lvl w:ilvl="2" w:tentative="1">
+      <w:start w:val="1"/>
+      <w:numFmt w:val="bullet"/>
+      <w:lvlText w:val=""/>
+      <w:lvlJc w:val="left"/>
+      <w:pPr>
+        <w:tabs>
+          <w:tab w:val="num" w:pos="2160"/>
+        </w:tabs>
+        <w:ind w:left="2160" w:hanging="360"/>
+      </w:pPr>
+      <w:rPr>
+        <w:rFonts w:ascii="Wingdings" w:hAnsi="Wingdings" w:hint="default"/>
+        <w:sz w:val="20"/>
+      </w:rPr>
+    </w:lvl>
+    <w:lvl w:ilvl="3" w:tentative="1">
+      <w:start w:val="1"/>
+      <w:numFmt w:val="bullet"/>
+      <w:lvlText w:val=""/>
+      <w:lvlJc w:val="left"/>
+      <w:pPr>
+        <w:tabs>
+          <w:tab w:val="num" w:pos="2880"/>
+        </w:tabs>
+        <w:ind w:left="2880" w:hanging="360"/>
+      </w:pPr>
+      <w:rPr>
+        <w:rFonts w:ascii="Wingdings" w:hAnsi="Wingdings" w:hint="default"/>
+        <w:sz w:val="20"/>
+      </w:rPr>
+    </w:lvl>
+    <w:lvl w:ilvl="4" w:tentative="1">
+      <w:start w:val="1"/>
+      <w:numFmt w:val="bullet"/>
+      <w:lvlText w:val=""/>
+      <w:lvlJc w:val="left"/>
+      <w:pPr>
+        <w:tabs>
+          <w:tab w:val="num" w:pos="3600"/>
+        </w:tabs>
+        <w:ind w:left="3600" w:hanging="360"/>
+      </w:pPr>
+      <w:rPr>
+        <w:rFonts w:ascii="Wingdings" w:hAnsi="Wingdings" w:hint="default"/>
+        <w:sz w:val="20"/>
+      </w:rPr>
+    </w:lvl>
+    <w:lvl w:ilvl="5" w:tentative="1">
+      <w:start w:val="1"/>
+      <w:numFmt w:val="bullet"/>
+      <w:lvlText w:val=""/>
+      <w:lvlJc w:val="left"/>
+      <w:pPr>
+        <w:tabs>
+          <w:tab w:val="num" w:pos="4320"/>
+        </w:tabs>
+        <w:ind w:left="4320" w:hanging="360"/>
+      </w:pPr>
+      <w:rPr>
+        <w:rFonts w:ascii="Wingdings" w:hAnsi="Wingdings" w:hint="default"/>
+        <w:sz w:val="20"/>
+      </w:rPr>
+    </w:lvl>
+    <w:lvl w:ilvl="6" w:tentative="1">
+      <w:start w:val="1"/>
+      <w:numFmt w:val="bullet"/>
+      <w:lvlText w:val=""/>
+      <w:lvlJc w:val="left"/>
+      <w:pPr>
+        <w:tabs>
+          <w:tab w:val="num" w:pos="5040"/>
+        </w:tabs>
+        <w:ind w:left="5040" w:hanging="360"/>
+      </w:pPr>
+      <w:rPr>
+        <w:rFonts w:ascii="Wingdings" w:hAnsi="Wingdings" w:hint="default"/>
+        <w:sz w:val="20"/>
+      </w:rPr>
+    </w:lvl>
+    <w:lvl w:ilvl="7" w:tentative="1">
+      <w:start w:val="1"/>
+      <w:numFmt w:val="bullet"/>
+      <w:lvlText w:val=""/>
+      <w:lvlJc w:val="left"/>
+      <w:pPr>
+        <w:tabs>
+          <w:tab w:val="num" w:pos="5760"/>
+        </w:tabs>
+        <w:ind w:left="5760" w:hanging="360"/>
+      </w:pPr>
+      <w:rPr>
+        <w:rFonts w:ascii="Wingdings" w:hAnsi="Wingdings" w:hint="default"/>
+        <w:sz w:val="20"/>
+      </w:rPr>
+    </w:lvl>
+    <w:lvl w:ilvl="8" w:tentative="1">
+      <w:start w:val="1"/>
+      <w:numFmt w:val="bullet"/>
+      <w:lvlText w:val=""/>
+      <w:lvlJc w:val="left"/>
+      <w:pPr>
+        <w:tabs>
+          <w:tab w:val="num" w:pos="6480"/>
+        </w:tabs>
+        <w:ind w:left="6480" w:hanging="360"/>
+      </w:pPr>
+      <w:rPr>
+        <w:rFonts w:ascii="Wingdings" w:hAnsi="Wingdings" w:hint="default"/>
+        <w:sz w:val="20"/>
+      </w:rPr>
+    </w:lvl>
+  </w:abstractNum>
+  <w:abstractNum w:abstractNumId="11" w15:restartNumberingAfterBreak="0">
     <w:nsid w:val="7A7B0C2C"/>
     <w:multiLevelType w:val="multilevel"/>
     <w:tmpl w:val="4E44F180"/>
@@ -6657,7 +8134,7 @@
       </w:rPr>
     </w:lvl>
   </w:abstractNum>
-  <w:abstractNum w:abstractNumId="10" w15:restartNumberingAfterBreak="0">
+  <w:abstractNum w:abstractNumId="12" w15:restartNumberingAfterBreak="0">
     <w:nsid w:val="7E5F5E93"/>
     <w:multiLevelType w:val="multilevel"/>
     <w:tmpl w:val="729C3AAA"/>
@@ -6825,7 +8302,7 @@
     <w:abstractNumId w:val="4"/>
   </w:num>
   <w:num w:numId="7" w16cid:durableId="1013267927">
-    <w:abstractNumId w:val="9"/>
+    <w:abstractNumId w:val="11"/>
   </w:num>
   <w:num w:numId="8" w16cid:durableId="2061663596">
     <w:abstractNumId w:val="5"/>
@@ -6834,9 +8311,15 @@
     <w:abstractNumId w:val="6"/>
   </w:num>
   <w:num w:numId="10" w16cid:durableId="762606011">
+    <w:abstractNumId w:val="9"/>
+  </w:num>
+  <w:num w:numId="11" w16cid:durableId="1737511649">
+    <w:abstractNumId w:val="12"/>
+  </w:num>
+  <w:num w:numId="12" w16cid:durableId="1085298820">
     <w:abstractNumId w:val="8"/>
   </w:num>
-  <w:num w:numId="11" w16cid:durableId="1737511649">
+  <w:num w:numId="13" w16cid:durableId="312418691">
     <w:abstractNumId w:val="10"/>
   </w:num>
 </w:numbering>
@@ -7445,6 +8928,7 @@
   <w:style w:type="character" w:default="1" w:styleId="Phngmcinhcuaoanvn">
     <w:name w:val="Default Paragraph Font"/>
     <w:uiPriority w:val="1"/>
+    <w:semiHidden/>
     <w:unhideWhenUsed/>
   </w:style>
   <w:style w:type="table" w:default="1" w:styleId="BangThngthng">

</xml_diff>